<commit_message>
Add rewritten JP-CN translation appendix to world book
Co-Authored-By: Claude Opus 5.5 <noreply@anthropic.com>
Claude-Session: https://claude.ai/code/session_01BkUHvVtkxEBBCip6XRXoJu
</commit_message>
<xml_diff>
--- a/worldbook/日本背景世界书by鲷鱼烧_2026.10.docx
+++ b/worldbook/日本背景世界书by鲷鱼烧_2026.10.docx
@@ -9,7 +9,7 @@
     </w:p>
     <w:p>
       <w:r>
-        <w:t>共 12 个文件 · 生成于 2026-10-10</w:t>
+        <w:t>共 13 个文件 · 生成于 2026-10-10</w:t>
       </w:r>
     </w:p>
     <w:p>
@@ -87,6 +87,11 @@
         <w:t>12. 大阪本地地名、说话方式、饮食文化by鲷鱼烧.docx　（第四层 · 关西）</w:t>
       </w:r>
     </w:p>
+    <w:p>
+      <w:r>
+        <w:t>13. 附件：日中双语输出时遵循原本语义v3by鲷鱼烧.docx　（附件 · 双语输出时常驻）</w:t>
+      </w:r>
+    </w:p>
     <w:p/>
     <w:p>
       <w:r>
@@ -309,12 +314,37 @@
     <w:p/>
     <w:p>
       <w:r>
-        <w:t>【附件】</w:t>
-      </w:r>
-    </w:p>
-    <w:p>
-      <w:r>
-        <w:t>原目录中的「日中双语输出时遵循原本语义」（翻译保真规范）不在这次上传的文件里，所以本版没有修改它，可以继续使用原版。</w:t>
+        <w:t>【附件（日语台词附中文翻译时常驻）】</w:t>
+      </w:r>
+    </w:p>
+    <w:p>
+      <w:r>
+        <w:t>- 日中双语翻译规范 &lt;jp_cn_translation&gt;：数量对齐、缓冲词保留、停在原句停的地方、力度对齐、不用网络用语和方言、命令句越短越冷，输出前在内部自检。</w:t>
+      </w:r>
+    </w:p>
+    <w:p>
+      <w:r>
+        <w:t xml:space="preserve">  v3 → 本版的改动：</w:t>
+      </w:r>
+    </w:p>
+    <w:p>
+      <w:r>
+        <w:t xml:space="preserve">  1. 改成中文，规则和例子放在一起。</w:t>
+      </w:r>
+    </w:p>
+    <w:p>
+      <w:r>
+        <w:t xml:space="preserve">  2. 原来"错误译法"散在各处，等于反复把这些词放进提示里。现在正文只写正确译法，需要替换的词集中放在最后一步自检里，只用来查找替换。</w:t>
+      </w:r>
+    </w:p>
+    <w:p>
+      <w:r>
+        <w:t xml:space="preserve">  3. 原来那段"绝对禁止……严重违规……打回重写"的强调改成平实的规则，并写了原因和三组例子。新模型对这种强调会过度反应，可能连正常的祈使句也不敢用。</w:t>
+      </w:r>
+    </w:p>
+    <w:p>
+      <w:r>
+        <w:t xml:space="preserve">  4. 新增一条：关西弁等日语地域特征只体现在日文原句里，中文统一用普通话口语，和本世界书的关西篇配合使用。</w:t>
       </w:r>
     </w:p>
     <w:p/>
@@ -2188,6 +2218,201 @@
     <w:p>
       <w:r>
         <w:t>&lt;/jp_local_osaka&gt;</w:t>
+      </w:r>
+    </w:p>
+    <w:p/>
+    <w:p>
+      <w:r>
+        <w:t>═════ 附件：日中双语输出时遵循原本语义v3by鲷鱼烧.docx ═════</w:t>
+      </w:r>
+    </w:p>
+    <w:p>
+      <w:r>
+        <w:t>&lt;jp_cn_translation&gt;</w:t>
+      </w:r>
+    </w:p>
+    <w:p>
+      <w:r>
+        <w:t>用途：角色用日语说话、同时附中文翻译时使用。中文要和日文原句的力度、语气等级、犹豫、停顿完全对齐。目标是"忠实"，不是"像中文网文那样顺"。</w:t>
+      </w:r>
+    </w:p>
+    <w:p>
+      <w:r>
+        <w:t>为什么：中文翻译一旦比原句更重、更满、更像网络用语，角色的性格就被改写了：犹豫的人变成果断，抱怨变成辱骂，冷淡变成表演强势。</w:t>
+      </w:r>
+    </w:p>
+    <w:p/>
+    <w:p>
+      <w:r>
+        <w:t>【五条规则】</w:t>
+      </w:r>
+    </w:p>
+    <w:p>
+      <w:r>
+        <w:t>1. 数量对齐：原句有几个动作、几个物件，译文就有几个。中文习惯成对的说法（嘴上说说→嘴上说说腿上不动）不要补出另一半。</w:t>
+      </w:r>
+    </w:p>
+    <w:p>
+      <w:r>
+        <w:t>2. 缓冲词保留：なんか、ちょっと、〜かな、〜けど 要译成看得见的犹豫，不能删，也不能改成干脆的陈述。</w:t>
+      </w:r>
+    </w:p>
+    <w:p>
+      <w:r>
+        <w:t xml:space="preserve">   なんか／なんとなく →「就是……」「也说不上为什么」</w:t>
+      </w:r>
+    </w:p>
+    <w:p>
+      <w:r>
+        <w:t xml:space="preserve">   ちょっと →「有点」「稍微」</w:t>
+      </w:r>
+    </w:p>
+    <w:p>
+      <w:r>
+        <w:t xml:space="preserve">   〜かな →「……吧」「说不定」</w:t>
+      </w:r>
+    </w:p>
+    <w:p>
+      <w:r>
+        <w:t xml:space="preserve">   〜けど →「……不过」然后停住，不替角色说完后半句。</w:t>
+      </w:r>
+    </w:p>
+    <w:p>
+      <w:r>
+        <w:t xml:space="preserve">   〜てやる → 保留那一点居高临下。</w:t>
+      </w:r>
+    </w:p>
+    <w:p>
+      <w:r>
+        <w:t>3. 原句停在哪里，译文就停在哪里：不补全句子，不加原文没有的情绪词和解释。</w:t>
+      </w:r>
+    </w:p>
+    <w:p>
+      <w:r>
+        <w:t xml:space="preserve">   「……好きかもな」→「……说不定是喜欢吧」</w:t>
+      </w:r>
+    </w:p>
+    <w:p>
+      <w:r>
+        <w:t>4. 力度对齐：同一个日语词，选更轻、更贴近原意的那个中文词。先问：是骂还是轻声抱怨？是评判还是描述？</w:t>
+      </w:r>
+    </w:p>
+    <w:p>
+      <w:r>
+        <w:t xml:space="preserve">   お荷物→拖油瓶｜めんどくさい→烦人／麻烦｜好き→喜欢｜うざい→烦／讨厌｜バカ→笨蛋／傻瓜｜二股かける女→脚踏两条船的女人</w:t>
+      </w:r>
+    </w:p>
+    <w:p>
+      <w:r>
+        <w:t xml:space="preserve">   描述行为的词不要升级成人格评判：軽い女→随便的女人｜面倒な人→麻烦的人</w:t>
+      </w:r>
+    </w:p>
+    <w:p>
+      <w:r>
+        <w:t>5. 用平实的现代口语：没有网络出身、听不出是哪个省的说法。</w:t>
+      </w:r>
+    </w:p>
+    <w:p>
+      <w:r>
+        <w:t xml:space="preserve">   すごい→真厉害｜ありえない→不可能／太扯了｜気まずい→好尴尬｜本格的→像样的／正经的｜引く→有点想离你远点</w:t>
+      </w:r>
+    </w:p>
+    <w:p>
+      <w:r>
+        <w:t xml:space="preserve">   关西弁、东京口癖这类地域特征只在日文原句里体现，中文统一用普通话口语（「わからへん」→「不知道」），不用中文方言去对应。</w:t>
+      </w:r>
+    </w:p>
+    <w:p/>
+    <w:p>
+      <w:r>
+        <w:t>【语气等级对照】</w:t>
+      </w:r>
+    </w:p>
+    <w:p>
+      <w:r>
+        <w:t>だろ＝带压迫感的"……吧／对吧"｜ぞ＝带挑衅的提醒｜じゃないか＝熟人之间的反问｜命令形＝直接的短句，不加"请"。</w:t>
+      </w:r>
+    </w:p>
+    <w:p/>
+    <w:p>
+      <w:r>
+        <w:t>【命令和不耐烦：越短越冷】</w:t>
+      </w:r>
+    </w:p>
+    <w:p>
+      <w:r>
+        <w:t>日语命令形（〜しろ、〜してろ）和不耐烦的台词，译成最短、最平的中文祈使句。冷意来自短，不来自加强语气的词。</w:t>
+      </w:r>
+    </w:p>
+    <w:p>
+      <w:r>
+        <w:t>「ちゃんと聞け」→「认真听」｜「黙ってろ」→「安静点」｜「さっさと行け」→「快走」</w:t>
+      </w:r>
+    </w:p>
+    <w:p>
+      <w:r>
+        <w:t>妥协的台词同样平而冷：「わかったよ」→「知道了」｜「もういい」→「算了」｜「好きにしろ」→「随你」｜「仕方ない」→「没办法」</w:t>
+      </w:r>
+    </w:p>
+    <w:p>
+      <w:r>
+        <w:t>单独一声叹气式的「真是的」可以用。</w:t>
+      </w:r>
+    </w:p>
+    <w:p/>
+    <w:p>
+      <w:r>
+        <w:t>【输出前在内部完成，只输出最终台词】</w:t>
+      </w:r>
+    </w:p>
+    <w:p>
+      <w:r>
+        <w:t>1. 先逐词直译一个草稿，不加任何修饰。</w:t>
+      </w:r>
+    </w:p>
+    <w:p>
+      <w:r>
+        <w:t>2. 用下面的问题检查草稿；任何一项是"是"，就改回原句的力度。</w:t>
+      </w:r>
+    </w:p>
+    <w:p>
+      <w:r>
+        <w:t xml:space="preserve">   - 比原句更重、更满、更直接了吗？</w:t>
+      </w:r>
+    </w:p>
+    <w:p>
+      <w:r>
+        <w:t xml:space="preserve">   - 有缓冲词被删掉或被说死了吗？</w:t>
+      </w:r>
+    </w:p>
+    <w:p>
+      <w:r>
+        <w:t xml:space="preserve">   - 原句停住的地方被补完了吗？</w:t>
+      </w:r>
+    </w:p>
+    <w:p>
+      <w:r>
+        <w:t xml:space="preserve">   - 行为描述被升级成人格评判了吗？</w:t>
+      </w:r>
+    </w:p>
+    <w:p>
+      <w:r>
+        <w:t xml:space="preserve">   - 妥协的话变成了抱怨或发泄吗？</w:t>
+      </w:r>
+    </w:p>
+    <w:p>
+      <w:r>
+        <w:t xml:space="preserve">   - 出现了网络用语或方言吗？常见的需要替换的有：给我＋动词／就给我＋动词（→直接说动词），绝了、离谱、硬核、社死、真的会谢、无语了、服了你了、你满意了吧、行了吧，儿化音和"咋、搁这、晓得、咯、啦"。</w:t>
+      </w:r>
+    </w:p>
+    <w:p>
+      <w:r>
+        <w:t>3. 输出改好的那一句。</w:t>
+      </w:r>
+    </w:p>
+    <w:p>
+      <w:r>
+        <w:t>&lt;/jp_cn_translation&gt;</w:t>
       </w:r>
     </w:p>
     <w:p/>

</xml_diff>

<commit_message>
Add family, alone-time, housing, non-standard path and minority modules
Co-Authored-By: Claude Opus 5.5 <noreply@anthropic.com>
Claude-Session: https://claude.ai/code/session_01BkUHvVtkxEBBCip6XRXoJu
</commit_message>
<xml_diff>
--- a/worldbook/日本背景世界书by鲷鱼烧_2026.10.docx
+++ b/worldbook/日本背景世界书by鲷鱼烧_2026.10.docx
@@ -9,7 +9,7 @@
     </w:p>
     <w:p>
       <w:r>
-        <w:t>共 13 个文件 · 生成于 2026-10-10</w:t>
+        <w:t>共 18 个文件 · 生成于 2026-10-10</w:t>
       </w:r>
     </w:p>
     <w:p>
@@ -79,17 +79,42 @@
     </w:p>
     <w:p>
       <w:r>
-        <w:t>11. 东京本地地名、说话方式、饮食文化by鲷鱼烧.docx　（第四层 · 东京）</w:t>
-      </w:r>
-    </w:p>
-    <w:p>
-      <w:r>
-        <w:t>12. 大阪本地地名、说话方式、饮食文化by鲷鱼烧.docx　（第四层 · 关西）</w:t>
-      </w:r>
-    </w:p>
-    <w:p>
-      <w:r>
-        <w:t>13. 附件：日中双语输出时遵循原本语义v3by鲷鱼烧.docx　（附件 · 双语输出时常驻）</w:t>
+        <w:t>11. 日本——家庭与出身篇by鲷鱼烧.docx　（第三层 · 建议常驻）</w:t>
+      </w:r>
+    </w:p>
+    <w:p>
+      <w:r>
+        <w:t>12. 日本——独处时间篇by鲷鱼烧.docx　（第三层 · 按需）</w:t>
+      </w:r>
+    </w:p>
+    <w:p>
+      <w:r>
+        <w:t>13. 日本——住处篇by鲷鱼烧.docx　（第三层 · 按需）</w:t>
+      </w:r>
+    </w:p>
+    <w:p>
+      <w:r>
+        <w:t>14. 日本——非标准路径篇by鲷鱼烧.docx　（第三层 · 非正式员工时常驻）</w:t>
+      </w:r>
+    </w:p>
+    <w:p>
+      <w:r>
+        <w:t>15. 日本——少数身份篇by鲷鱼烧.docx　（第三层 · 相关身份时常驻）</w:t>
+      </w:r>
+    </w:p>
+    <w:p>
+      <w:r>
+        <w:t>16. 东京本地地名、说话方式、饮食文化by鲷鱼烧.docx　（第四层 · 东京）</w:t>
+      </w:r>
+    </w:p>
+    <w:p>
+      <w:r>
+        <w:t>17. 大阪本地地名、说话方式、饮食文化by鲷鱼烧.docx　（第四层 · 关西）</w:t>
+      </w:r>
+    </w:p>
+    <w:p>
+      <w:r>
+        <w:t>18. 附件：日中双语输出时遵循原本语义v3by鲷鱼烧.docx　（附件 · 双语输出时常驻）</w:t>
       </w:r>
     </w:p>
     <w:p/>
@@ -117,7 +142,7 @@
     </w:p>
     <w:p>
       <w:r>
-        <w:t>1. 篇幅（token 数）约为原版的一半，内容全部改为中文（日语原词保留），方便自己修改。</w:t>
+        <w:t>1. 原有12篇的篇幅（token 数）压缩到约一半；加上新增的5篇，总量约为原版的七成，内容全部改为中文（日语原词保留），方便自己修改。</w:t>
       </w:r>
     </w:p>
     <w:p>
@@ -152,7 +177,12 @@
     </w:p>
     <w:p>
       <w:r>
-        <w:t>8. 补正过时说法：东京房租已远超原版的7.6万日元；「30万円初任給」只是少数大企业。</w:t>
+        <w:t>8. 新增五个主题模块：家庭与出身、独处时间、住处、非标准路径、少数身份（补上原版计划过但没写的部分）。</w:t>
+      </w:r>
+    </w:p>
+    <w:p>
+      <w:r>
+        <w:t>9. 补正过时说法：东京房租已远超原版的7.6万日元；「30万円初任給」只是少数大企业。</w:t>
       </w:r>
     </w:p>
     <w:p/>
@@ -279,6 +309,56 @@
         <w:t xml:space="preserve">  触发词参考：推し、ライブ、アニメ、ゲーム、インスタ、界隈</w:t>
       </w:r>
     </w:p>
+    <w:p>
+      <w:r>
+        <w:t>- 家庭与出身 &lt;jp_theme_family&gt;：父母和兄弟姐妹、家里的说话方式、排行、親ガチャ、照护、墓じまい。</w:t>
+      </w:r>
+    </w:p>
+    <w:p>
+      <w:r>
+        <w:t xml:space="preserve">  建议常驻：角色卡没写家庭时，它会给角色补一个具体的家。</w:t>
+      </w:r>
+    </w:p>
+    <w:p>
+      <w:r>
+        <w:t>- 独处时间 &lt;jp_theme_alone&gt;：一个人的深夜、ひとり行動、房间里的声音、孤独。</w:t>
+      </w:r>
+    </w:p>
+    <w:p>
+      <w:r>
+        <w:t xml:space="preserve">  触发词参考：一人、ひとり、家、夜、寂しい</w:t>
+      </w:r>
+    </w:p>
+    <w:p>
+      <w:r>
+        <w:t>- 住处 &lt;jp_theme_home&gt;：1K、狭小物件、实家、社员寮、合租、垃圾分类、墙薄。</w:t>
+      </w:r>
+    </w:p>
+    <w:p>
+      <w:r>
+        <w:t xml:space="preserve">  触发词参考：部屋、家、引っ越し、実家、隣</w:t>
+      </w:r>
+    </w:p>
+    <w:p>
+      <w:r>
+        <w:t>- 非标准路径 &lt;jp_theme_path&gt;：非正式雇用、スキマバイト、副业、自由职业、专门学校、助学贷款。</w:t>
+      </w:r>
+    </w:p>
+    <w:p>
+      <w:r>
+        <w:t xml:space="preserve">  角色不是正式员工时常驻。</w:t>
+      </w:r>
+    </w:p>
+    <w:p>
+      <w:r>
+        <w:t>- 少数身份 &lt;jp_theme_minority&gt;：LGBTQ+、外国人和外国出身、混血、在日韩国人朝鲜人、残障和发育障碍。</w:t>
+      </w:r>
+    </w:p>
+    <w:p>
+      <w:r>
+        <w:t xml:space="preserve">  角色有相关身份时常驻。</w:t>
+      </w:r>
+    </w:p>
     <w:p/>
     <w:p>
       <w:r>
@@ -1852,6 +1932,745 @@
     <w:p>
       <w:r>
         <w:t>&lt;/jp_theme_culture&gt;</w:t>
+      </w:r>
+    </w:p>
+    <w:p/>
+    <w:p>
+      <w:r>
+        <w:t>═════ 日本——家庭与出身篇by鲷鱼烧.docx ═════</w:t>
+      </w:r>
+    </w:p>
+    <w:p>
+      <w:r>
+        <w:t>&lt;jp_theme_family&gt;</w:t>
+      </w:r>
+    </w:p>
+    <w:p>
+      <w:r>
+        <w:t>用途：写角色和父母、兄弟姐妹、老家的关系，以及出身对他的塑造。角色卡没写家庭时，也用本篇给他补一个具体的家。</w:t>
+      </w:r>
+    </w:p>
+    <w:p/>
+    <w:p>
+      <w:r>
+        <w:t>【写法总则】</w:t>
+      </w:r>
+    </w:p>
+    <w:p>
+      <w:r>
+        <w:t>- 每个角色都有一个家，哪怕已经不联系。给家庭三个具体信息：父母做什么工作、他在兄弟姐妹里排第几、现在多久联系一次。</w:t>
+      </w:r>
+    </w:p>
+    <w:p>
+      <w:r>
+        <w:t>- 家人在场景里的出现方式是具体的：LINE里母亲发来的一张照片和「元気？」、每月的生活费、过年回不回去、电话里父亲只说一句「お母さんに代わる」。</w:t>
+      </w:r>
+    </w:p>
+    <w:p/>
+    <w:p>
+      <w:r>
+        <w:t>【家里的说话方式】</w:t>
+      </w:r>
+    </w:p>
+    <w:p>
+      <w:r>
+        <w:t>- 很多日本家庭不直接说"爱"和"担心"。担心写成：寄来一箱老家的蔬菜和大米、「ちゃんと食べてる？」、在玄关多送一程。</w:t>
+      </w:r>
+    </w:p>
+    <w:p>
+      <w:r>
+        <w:t>- 父亲常常是沉默的角色，母亲是传话的人。父子之间的话可能都经过母亲转述。</w:t>
+      </w:r>
+    </w:p>
+    <w:p>
+      <w:r>
+        <w:t>- 写法：家人表达关心时，用东西和重复的问话代替直说。角色回应时也一样，用「うん、大丈夫」挡回去。</w:t>
+      </w:r>
+    </w:p>
+    <w:p/>
+    <w:p>
+      <w:r>
+        <w:t>【排行与角色】</w:t>
+      </w:r>
+    </w:p>
+    <w:p>
+      <w:r>
+        <w:t>- 长子・长女：被期待继承、照顾父母、做榜样。"墓和老家谁来管"会落到他们身上。</w:t>
+      </w:r>
+    </w:p>
+    <w:p>
+      <w:r>
+        <w:t>- 中间的孩子：容易被忽略，学会自己处理。</w:t>
+      </w:r>
+    </w:p>
+    <w:p>
+      <w:r>
+        <w:t>- 末子：被宠，或者被一直当小孩。</w:t>
+      </w:r>
+    </w:p>
+    <w:p>
+      <w:r>
+        <w:t>- 独生子女：父母的期待和将来的照护都只落在一个人身上。</w:t>
+      </w:r>
+    </w:p>
+    <w:p/>
+    <w:p>
+      <w:r>
+        <w:t>【2026年的家庭背景（取用一两条即可）】</w:t>
+      </w:r>
+    </w:p>
+    <w:p>
+      <w:r>
+        <w:t>- 双职工家庭约占七成，"父亲上班、母亲在家"已经是少数。</w:t>
+      </w:r>
+    </w:p>
+    <w:p>
+      <w:r>
+        <w:t>- 2025年离婚约18万对，结婚约49万对。单亲家庭（多为母亲带孩子）并不少见。</w:t>
+      </w:r>
+    </w:p>
+    <w:p>
+      <w:r>
+        <w:t>- 角色身边可能有：未成年时就在照顾家人的人（ヤングケアラー）、为照护父母辞职的长辈、在家里蛰居多年的兄弟姐妹（全国约146万人处于ひきこもり状态，父母老去后变成"8050问题"）。</w:t>
+      </w:r>
+    </w:p>
+    <w:p>
+      <w:r>
+        <w:t>- 墓じまい（处理老家的坟墓）创历史新高，原因是坟在远方、没人继承。长子长女会被问"以后墓怎么办"。</w:t>
+      </w:r>
+    </w:p>
+    <w:p>
+      <w:r>
+        <w:t>- 选择性夫妇别姓至今没有实现，结婚时绝大多数是女方改姓，工作上继续用旧姓。</w:t>
+      </w:r>
+    </w:p>
+    <w:p/>
+    <w:p>
+      <w:r>
+        <w:t>【出身决定了起点】</w:t>
+      </w:r>
+    </w:p>
+    <w:p>
+      <w:r>
+        <w:t>- 家里的经济状况决定能不能上私立、能不能去补习班、能不能去东京读大学。网络上用「親ガチャ」（父母是抽卡抽到的）形容这种不由自己决定的起点。</w:t>
+      </w:r>
+    </w:p>
+    <w:p>
+      <w:r>
+        <w:t>- 「毒親」（控制欲强、伤害孩子的父母）这个词让很多人第一次能说出家里的问题。说出来的人和没说出来的人都有。</w:t>
+      </w:r>
+    </w:p>
+    <w:p>
+      <w:r>
+        <w:t>- 关西、东北、九州等出身会带着口音和饮食习惯；家里是开店的、务农的、公司职员、公务员，会影响角色对"稳定"和"钱"的看法。</w:t>
+      </w:r>
+    </w:p>
+    <w:p/>
+    <w:p>
+      <w:r>
+        <w:t>【和父母的距离】</w:t>
+      </w:r>
+    </w:p>
+    <w:p>
+      <w:r>
+        <w:t>- 实家暮らし（和父母同住）在未婚年轻人中很常见，不算丢人，但被问到时会有点在意。</w:t>
+      </w:r>
+    </w:p>
+    <w:p>
+      <w:r>
+        <w:t>- 离家的人：每次帰省都被当成离开时的那个孩子。</w:t>
+      </w:r>
+    </w:p>
+    <w:p>
+      <w:r>
+        <w:t>- 父母老去：二三十岁的角色开始意识到父母会生病、要照护。这件事常在某个电话或某次帰省时突然变得具体。</w:t>
+      </w:r>
+    </w:p>
+    <w:p/>
+    <w:p>
+      <w:r>
+        <w:t>【差异】和家里关系很好的人、表面和睦但不说真话的人、断了联系的人、离不开家的人、在照顾家人的人。写之前先决定是哪一种，并让它在一个具体细节里出现。</w:t>
+      </w:r>
+    </w:p>
+    <w:p>
+      <w:r>
+        <w:t>&lt;/jp_theme_family&gt;</w:t>
+      </w:r>
+    </w:p>
+    <w:p/>
+    <w:p>
+      <w:r>
+        <w:t>═════ 日本——独处时间篇by鲷鱼烧.docx ═════</w:t>
+      </w:r>
+    </w:p>
+    <w:p>
+      <w:r>
+        <w:t>&lt;jp_theme_alone&gt;</w:t>
+      </w:r>
+    </w:p>
+    <w:p>
+      <w:r>
+        <w:t>用途：角色一个人住、一个人行动，或者需要写"没有别人在场时他是什么样"。很多角色最真实的一面出现在这里。</w:t>
+      </w:r>
+    </w:p>
+    <w:p/>
+    <w:p>
+      <w:r>
+        <w:t>【写法总则】</w:t>
+      </w:r>
+    </w:p>
+    <w:p>
+      <w:r>
+        <w:t>- 独处时，角色不再需要管理表情和语气。写出这种变化：进门后的第一个动作（踢掉鞋、直接倒在床上、先开换气扇抽根烟）、声音变了、姿势垮了。</w:t>
+      </w:r>
+    </w:p>
+    <w:p>
+      <w:r>
+        <w:t>- 独处不等于孤独。先确定这一刻是"终于一个人了"还是"又是一个人"，再写；两种感觉可以在同一晚交替出现。</w:t>
+      </w:r>
+    </w:p>
+    <w:p/>
+    <w:p>
+      <w:r>
+        <w:t>【一个人的时间从哪来】</w:t>
+      </w:r>
+    </w:p>
+    <w:p>
+      <w:r>
+        <w:t>- 下班回家到睡前，是一天里唯一不用对谁负责的时段，所以常常熬夜，舍不得睡（「リベンジ夜ふかし」）。</w:t>
+      </w:r>
+    </w:p>
+    <w:p>
+      <w:r>
+        <w:t>- 周末的上午、通勤路上戴着耳机的四十分钟、午休时躲进便利店或楼梯间的十分钟。</w:t>
+      </w:r>
+    </w:p>
+    <w:p>
+      <w:r>
+        <w:t>- 一个完全没有安排的休息日：可能睡到中午、一整天不说一句话，傍晚才发现。</w:t>
+      </w:r>
+    </w:p>
+    <w:p/>
+    <w:p>
+      <w:r>
+        <w:t>【一个人做事很普通】</w:t>
+      </w:r>
+    </w:p>
+    <w:p>
+      <w:r>
+        <w:t>- ひとり行動在日本很常见：一个人吃拉面、烤肉（ひとり焼肉）、唱K（ヒトカラ）、看电影、去旅行、去居酒屋吧台。店里有专门的单人座和隔板。</w:t>
+      </w:r>
+    </w:p>
+    <w:p>
+      <w:r>
+        <w:t>- 有人享受（「ソロ活」「おひとりさま」是正面的说法），有人只是没人一起。</w:t>
+      </w:r>
+    </w:p>
+    <w:p>
+      <w:r>
+        <w:t>- 写法：让角色在单人座上做一件只有一个人时才做的小事：边吃边看手机里的推し、点了平时不好意思点的大份、对着空气小声说「うま」。</w:t>
+      </w:r>
+    </w:p>
+    <w:p/>
+    <w:p>
+      <w:r>
+        <w:t>【房间里的独处】</w:t>
+      </w:r>
+    </w:p>
+    <w:p>
+      <w:r>
+        <w:t>- 声音：冰箱的嗡嗡声、隔壁的洗衣机、楼道里的脚步、远处的电车。墙薄，所以自己也会放低声音。</w:t>
+      </w:r>
+    </w:p>
+    <w:p>
+      <w:r>
+        <w:t>- 屏幕：手机是独处时的主要伙伴。刷X、看YouTube、反复打开LINE看对方有没有回、开着直播当背景音。</w:t>
+      </w:r>
+    </w:p>
+    <w:p>
+      <w:r>
+        <w:t>- 吃：在被窝旁边的小桌上吃便利店便当，碗不想洗就泡在水槽里。</w:t>
+      </w:r>
+    </w:p>
+    <w:p>
+      <w:r>
+        <w:t>- 写法：用一两个声音或物件定位房间，不写大段环境描写。</w:t>
+      </w:r>
+    </w:p>
+    <w:p/>
+    <w:p>
+      <w:r>
+        <w:t>【独处里会冒出来的东西】</w:t>
+      </w:r>
+    </w:p>
+    <w:p>
+      <w:r>
+        <w:t>- 白天压住的事，在一个人的深夜回来：一句没说出口的话、一个没回的消息、"这样过下去可以吗"。</w:t>
+      </w:r>
+    </w:p>
+    <w:p>
+      <w:r>
+        <w:t>- 打了一大段字发给某人，又全部删掉。打开对方的头像看很久。</w:t>
+      </w:r>
+    </w:p>
+    <w:p>
+      <w:r>
+        <w:t>- 喝一罐便利店的チューハイ，然后又一罐。</w:t>
+      </w:r>
+    </w:p>
+    <w:p>
+      <w:r>
+        <w:t>- 写法：独处场景里，让角色做一件在别人面前不会做的事，这件事要能透露他的真实状态。</w:t>
+      </w:r>
+    </w:p>
+    <w:p/>
+    <w:p>
+      <w:r>
+        <w:t>【孤独】</w:t>
+      </w:r>
+    </w:p>
+    <w:p>
+      <w:r>
+        <w:t>- 日本把孤独当作社会问题对待：2024年起有专门的法律，政府有孤独对策担当大臣。调查中约四成人表示有时或经常感到孤独，二三十岁的比例更高。</w:t>
+      </w:r>
+    </w:p>
+    <w:p>
+      <w:r>
+        <w:t>- 孤独很少被说出口。角色会说「最近ずっと家にいる」「別に、普通」，或用一个玩笑带过。</w:t>
+      </w:r>
+    </w:p>
+    <w:p>
+      <w:r>
+        <w:t>- 外在信号：周末两天没跟任何人说话；收到店员一句「いつもありがとうございます」会愣一下；生病时意识到没人可以叫。</w:t>
+      </w:r>
+    </w:p>
+    <w:p/>
+    <w:p>
+      <w:r>
+        <w:t>【差异】有人一个人过得很满足，有人害怕安静所以一直开着电视，有人以为自己享受独处，直到某天有人来过之后才发现不是。</w:t>
+      </w:r>
+    </w:p>
+    <w:p>
+      <w:r>
+        <w:t>&lt;/jp_theme_alone&gt;</w:t>
+      </w:r>
+    </w:p>
+    <w:p/>
+    <w:p>
+      <w:r>
+        <w:t>═════ 日本——住处篇by鲷鱼烧.docx ═════</w:t>
+      </w:r>
+    </w:p>
+    <w:p>
+      <w:r>
+        <w:t>&lt;jp_theme_home&gt;</w:t>
+      </w:r>
+    </w:p>
+    <w:p>
+      <w:r>
+        <w:t>用途：给角色一个具体的住处。住在哪种房子里，决定了他的隐私、作息、开销，以及能不能带人回家。</w:t>
+      </w:r>
+    </w:p>
+    <w:p/>
+    <w:p>
+      <w:r>
+        <w:t>【写法总则】确定四件事并在场景里体现：房型和面积、和谁住、离最近车站走几分钟、墙有多薄。</w:t>
+      </w:r>
+    </w:p>
+    <w:p/>
+    <w:p>
+      <w:r>
+        <w:t>【常见的住法】</w:t>
+      </w:r>
+    </w:p>
+    <w:p>
+      <w:r>
+        <w:t>- 1K／ワンルーム（约20〜25㎡）：一个人住的标准起点。床、桌、迷你厨房在同一个空间，洗衣机放在阳台或门口，浴室和厕所可能在一起（ユニットバス）。东京房租持续上涨，越来越多人选更小、更远、更旧的房子。</w:t>
+      </w:r>
+    </w:p>
+    <w:p>
+      <w:r>
+        <w:t>- 狭小物件：东京有三四个榻榻米大的超小房间，阁楼睡觉，房租压低，但贴近车站。选它的人看重地段胜过空间。</w:t>
+      </w:r>
+    </w:p>
+    <w:p>
+      <w:r>
+        <w:t>- 实家暮らし：和父母同住。省钱，但有门禁感、晚归要解释、带人回家很难。</w:t>
+      </w:r>
+    </w:p>
+    <w:p>
+      <w:r>
+        <w:t xml:space="preserve">  未婚年轻人和父母同住的比例约七成，二十多岁自己买房的约15%。</w:t>
+      </w:r>
+    </w:p>
+    <w:p>
+      <w:r>
+        <w:t>- 社员寮・借り上げ社宅：公司提供或补贴的宿舍。房租便宜，但同事就住隔壁，下班也离不开公司的人际关系。</w:t>
+      </w:r>
+    </w:p>
+    <w:p>
+      <w:r>
+        <w:t>- シェアハウス：共用厨房和客厅，各自有小房间。冰箱里的食物贴名字，浴室排队，和陌生室友保持礼貌的距离。</w:t>
+      </w:r>
+    </w:p>
+    <w:p>
+      <w:r>
+        <w:t>- 地方：同样的钱能租到大很多的房子，但必须有车。</w:t>
+      </w:r>
+    </w:p>
+    <w:p/>
+    <w:p>
+      <w:r>
+        <w:t>【房子里的规矩】</w:t>
+      </w:r>
+    </w:p>
+    <w:p>
+      <w:r>
+        <w:t>- 玄关脱鞋；垃圾按日期和种类分好，早上8点前拿到集积点，分错了会被贴纸退回。</w:t>
+      </w:r>
+    </w:p>
+    <w:p>
+      <w:r>
+        <w:t>- 墙薄：晚上10点后避免洗衣机和大声说话，邻居会通过管理公司投诉。</w:t>
+      </w:r>
+    </w:p>
+    <w:p>
+      <w:r>
+        <w:t>- 合同：入住要保证人或保证公司、两年一更新、更新费、退房时的原状恢复费用。有的房子写着「楽器不可」「ペット不可」「二人入居不可」。</w:t>
+      </w:r>
+    </w:p>
+    <w:p>
+      <w:r>
+        <w:t>- 外国人、高龄者、无固定工作的人租房更难，常被拒。</w:t>
+      </w:r>
+    </w:p>
+    <w:p/>
+    <w:p>
+      <w:r>
+        <w:t>【写法】让房子影响剧情：</w:t>
+      </w:r>
+    </w:p>
+    <w:p>
+      <w:r>
+        <w:t>- 带人回家前，先想到墙薄、房间乱、只有一个杯子。</w:t>
+      </w:r>
+    </w:p>
+    <w:p>
+      <w:r>
+        <w:t>- 吵架时压低声音，因为隔壁听得见。</w:t>
+      </w:r>
+    </w:p>
+    <w:p>
+      <w:r>
+        <w:t>- 实家暮らし的角色约会到很晚，要编一个理由或发LINE报备。</w:t>
+      </w:r>
+    </w:p>
+    <w:p>
+      <w:r>
+        <w:t>- 搬家是一个转折点：涨薪、恋爱、分手、换工作，常伴随一次搬家。</w:t>
+      </w:r>
+    </w:p>
+    <w:p>
+      <w:r>
+        <w:t>&lt;/jp_theme_home&gt;</w:t>
+      </w:r>
+    </w:p>
+    <w:p/>
+    <w:p>
+      <w:r>
+        <w:t>═════ 日本——非标准路径篇by鲷鱼烧.docx ═════</w:t>
+      </w:r>
+    </w:p>
+    <w:p>
+      <w:r>
+        <w:t>&lt;jp_theme_path&gt;</w:t>
+      </w:r>
+    </w:p>
+    <w:p>
+      <w:r>
+        <w:t>用途：角色不走"毕业→正式员工→结婚"这条标准线时使用：打工、派遣、自由职业、蛰居、复读、专门学校、辞职后空白期。这些人在日本很多，角色卡常常把他们写得像标准上班族。</w:t>
+      </w:r>
+    </w:p>
+    <w:p/>
+    <w:p>
+      <w:r>
+        <w:t>【写法总则】</w:t>
+      </w:r>
+    </w:p>
+    <w:p>
+      <w:r>
+        <w:t>- 先确定身份标签，它决定了收入、时间表和别人看他的眼光：正社員／契約社員／派遣／パート・アルバイト／フリーター／フリーランス／無職。</w:t>
+      </w:r>
+    </w:p>
+    <w:p>
+      <w:r>
+        <w:t>- 被问「お仕事何されてるんですか？」是这类角色的常见小压力。写出他准备好的说法，以及说的时候的停顿。</w:t>
+      </w:r>
+    </w:p>
+    <w:p/>
+    <w:p>
+      <w:r>
+        <w:t>【2026年的现实】</w:t>
+      </w:r>
+    </w:p>
+    <w:p>
+      <w:r>
+        <w:t>- 雇员里约三分之一以上是非正式雇用。最常见的理由是"想在方便的时间工作"，并非都出于无奈。</w:t>
+      </w:r>
+    </w:p>
+    <w:p>
+      <w:r>
+        <w:t>- 打工时薪以最低工资为基准：东京约1280日元。</w:t>
+      </w:r>
+    </w:p>
+    <w:p>
+      <w:r>
+        <w:t>- スキマバイト：用Timee这类App，当天找一个几小时的活，干完当天结钱。登记的人超过一千万。角色可以靠它补贴月末、在两份工作之间过渡。</w:t>
+      </w:r>
+    </w:p>
+    <w:p>
+      <w:r>
+        <w:t>- 副业很普遍：七成以上企业允许副业。上班族晚上接设计、写作、外卖配送。</w:t>
+      </w:r>
+    </w:p>
+    <w:p>
+      <w:r>
+        <w:t>- 外卖配送员（Uber Eats、出前館）：骑自行车或摩托，看天气和时段吃饭。</w:t>
+      </w:r>
+    </w:p>
+    <w:p>
+      <w:r>
+        <w:t>- 自由职业者：2024年起有专门保护他们的法律，但收入不稳、没有社保优惠、租房审查难。</w:t>
+      </w:r>
+    </w:p>
+    <w:p>
+      <w:r>
+        <w:t>- 约57万年轻人处于无业状态（ニート）。蛰居（ひきこもり）的人更多，年龄分布很广。</w:t>
+      </w:r>
+    </w:p>
+    <w:p/>
+    <w:p>
+      <w:r>
+        <w:t>【学历路线】</w:t>
+      </w:r>
+    </w:p>
+    <w:p>
+      <w:r>
+        <w:t>- 大学升学率约六成，另有两成多上专门学校（美容、料理、IT、动画、护理等），学一门手艺直接就业。</w:t>
+      </w:r>
+    </w:p>
+    <w:p>
+      <w:r>
+        <w:t>- 很多人背着助学贷款（奨学金），本科平均借三百多万日元，要还十几年。每月还款是固定支出，也会影响结婚和换工作的决定。</w:t>
+      </w:r>
+    </w:p>
+    <w:p>
+      <w:r>
+        <w:t>- 复读（浪人）、休学、读到一半退学，都会在之后的就活中被问到。</w:t>
+      </w:r>
+    </w:p>
+    <w:p/>
+    <w:p>
+      <w:r>
+        <w:t>【别人怎么看】</w:t>
+      </w:r>
+    </w:p>
+    <w:p>
+      <w:r>
+        <w:t>- 父母和亲戚：「いつ就職するの？」「正社員にならないの？」</w:t>
+      </w:r>
+    </w:p>
+    <w:p>
+      <w:r>
+        <w:t>- 同学聚会：别人报出公司名时，他报的是"在做点自己的事"。</w:t>
+      </w:r>
+    </w:p>
+    <w:p>
+      <w:r>
+        <w:t>- 恋爱和婚活：非正式雇用的男性在婚活市场上明显吃亏，这是他们会在意的事。</w:t>
+      </w:r>
+    </w:p>
+    <w:p>
+      <w:r>
+        <w:t>- 但在一些圈子里（音乐、演剧、创作、某些界隈），打工生活是常态，没人在乎。</w:t>
+      </w:r>
+    </w:p>
+    <w:p/>
+    <w:p>
+      <w:r>
+        <w:t>【写法】</w:t>
+      </w:r>
+    </w:p>
+    <w:p>
+      <w:r>
+        <w:t>- 时间表和别人不一样：平日白天有空、周末上班、深夜回家。可以用来写他和上班族的错位。</w:t>
+      </w:r>
+    </w:p>
+    <w:p>
+      <w:r>
+        <w:t>- 钱按周或按天算，而不是按月。</w:t>
+      </w:r>
+    </w:p>
+    <w:p>
+      <w:r>
+        <w:t>- 有一个"打工之外真正想做的事"，或者没有。两者都要写得具体。</w:t>
+      </w:r>
+    </w:p>
+    <w:p>
+      <w:r>
+        <w:t>&lt;/jp_theme_path&gt;</w:t>
+      </w:r>
+    </w:p>
+    <w:p/>
+    <w:p>
+      <w:r>
+        <w:t>═════ 日本——少数身份篇by鲷鱼烧.docx ═════</w:t>
+      </w:r>
+    </w:p>
+    <w:p>
+      <w:r>
+        <w:t>&lt;jp_theme_minority&gt;</w:t>
+      </w:r>
+    </w:p>
+    <w:p>
+      <w:r>
+        <w:t>用途：角色是LGBTQ+、外国人或外国出身、混血、在日韩国人朝鲜人、残障或发育障碍者时使用。这些身份是他在社会里的处境，不是他的全部性格。</w:t>
+      </w:r>
+    </w:p>
+    <w:p/>
+    <w:p>
+      <w:r>
+        <w:t>【写法总则】</w:t>
+      </w:r>
+    </w:p>
+    <w:p>
+      <w:r>
+        <w:t>- 身份影响的是具体的日常：表格上的一栏、租房时的一个电话、被问「どこの国の人？」、公司体检时要不要说。写这些具体时刻，不要写成大段的社会议题讨论。</w:t>
+      </w:r>
+    </w:p>
+    <w:p>
+      <w:r>
+        <w:t>- 让角色自己决定对谁说、说多少。在日本，很多少数身份者选择"不特别说出来"（カミングアウトしない）来保护自己的日常。这是策略，不是软弱。</w:t>
+      </w:r>
+    </w:p>
+    <w:p>
+      <w:r>
+        <w:t>- 角色有自己的兴趣、工作、恋爱和缺点，身份只是其中一层。</w:t>
+      </w:r>
+    </w:p>
+    <w:p/>
+    <w:p>
+      <w:r>
+        <w:t>【LGBTQ+】</w:t>
+      </w:r>
+    </w:p>
+    <w:p>
+      <w:r>
+        <w:t>- 同性婚姻在日本还不合法。高等法院的六起诉讼中有五起判决"不允许同性婚姻违宪"；2026年最高法院已把案件交给大法庭审理，还没有判决。这是新闻里会出现的话题。</w:t>
+      </w:r>
+    </w:p>
+    <w:p>
+      <w:r>
+        <w:t>- 同性伴侣证明制度：已覆盖九成以上人口的自治体，可用于公营住宅申请、医院探视等，但没有婚姻的法律效力（继承、税、签证都不算）。</w:t>
+      </w:r>
+    </w:p>
+    <w:p>
+      <w:r>
+        <w:t>- 日常：职场上多数人不出柜；被问「彼女いるの？」时用模糊的回答带过；新宿二丁目、大阪堂山町是熟悉的去处；很多人在网上或小圈子里才能放松。</w:t>
+      </w:r>
+    </w:p>
+    <w:p>
+      <w:r>
+        <w:t>- 写法：角色对家人说不说、对公司说不说，通常是两个不同的决定。</w:t>
+      </w:r>
+    </w:p>
+    <w:p/>
+    <w:p>
+      <w:r>
+        <w:t>【外国人与外国出身】</w:t>
+      </w:r>
+    </w:p>
+    <w:p>
+      <w:r>
+        <w:t>- 2025年底在留外国人约413万，首次超过400万，约占人口3%。最多的是中国、越南、韩国籍。东京约80万人。便利店、居酒屋、工厂、护理现场常有外国员工。</w:t>
+      </w:r>
+    </w:p>
+    <w:p>
+      <w:r>
+        <w:t>- 制度：技能实习制度将在2027年改为"育成就劳"。永住和入籍的审查在收紧。</w:t>
+      </w:r>
+    </w:p>
+    <w:p>
+      <w:r>
+        <w:t>- 气氛：2025年参院选后"日本人优先"的说法进入政治，外国人政策成为选举争点；调查中七成多的人担心治安。外国人角色可能在网上看到针对外国人的言论，被房东拒租，在入管办手续时紧张。同时，大多数日常相处仍是礼貌而平常的。</w:t>
+      </w:r>
+    </w:p>
+    <w:p>
+      <w:r>
+        <w:t>- 写法：外国人角色的日语水平要具体（敬语用得好不好、读不读得懂公文）。别人常夸「日本語上手ですね」，他听到第一百次时的反应可以写。</w:t>
+      </w:r>
+    </w:p>
+    <w:p/>
+    <w:p>
+      <w:r>
+        <w:t>【混血（ミックスルーツ、ハーフ）】</w:t>
+      </w:r>
+    </w:p>
+    <w:p>
+      <w:r>
+        <w:t>- 约每20〜40个新生儿中就有1个父母一方是外国人（统计口径不同，比例约2〜5%）。</w:t>
+      </w:r>
+    </w:p>
+    <w:p>
+      <w:r>
+        <w:t>- 常见经历：外表被评论、被默认会说英语、在学校被叫「ハーフ」、被问「何人？」。在日本长大、只会日语的人尤其别扭。</w:t>
+      </w:r>
+    </w:p>
+    <w:p>
+      <w:r>
+        <w:t>- 写法：写他对这些问题已经形成的固定回答，以及在什么时候会懒得回答。</w:t>
+      </w:r>
+    </w:p>
+    <w:p/>
+    <w:p>
+      <w:r>
+        <w:t>【在日韩国人・朝鲜人】</w:t>
+      </w:r>
+    </w:p>
+    <w:p>
+      <w:r>
+        <w:t>- 多为战前战后来日者的后代，以特别永住者身份生活，约二十多万人。很多人用日本名字（通名），日语是母语。</w:t>
+      </w:r>
+    </w:p>
+    <w:p>
+      <w:r>
+        <w:t>- 有人入籍，有人不入；有人在民族学校长大，有人到长大才知道家里的出身。就职、结婚时出身问题可能浮出水面。</w:t>
+      </w:r>
+    </w:p>
+    <w:p/>
+    <w:p>
+      <w:r>
+        <w:t>【残障与发育障碍】</w:t>
+      </w:r>
+    </w:p>
+    <w:p>
+      <w:r>
+        <w:t>- 2024年4月起，民间企业有法定义务提供"合理配慮"（例如调整工作方式、提供文字信息）。</w:t>
+      </w:r>
+    </w:p>
+    <w:p>
+      <w:r>
+        <w:t>- 发育障碍（ADHD、自闭症谱系）的认知度提高，成年后才确诊的人很多。角色可能在网上测过、去过诊所，但不一定告诉公司。</w:t>
+      </w:r>
+    </w:p>
+    <w:p>
+      <w:r>
+        <w:t>- 写法：写具体的困难和应对（用待办清单App、戴降噪耳机、在嘈杂的饮み会里提前离开），而不是用诊断名代替性格。</w:t>
+      </w:r>
+    </w:p>
+    <w:p>
+      <w:r>
+        <w:t>&lt;/jp_theme_minority&gt;</w:t>
       </w:r>
     </w:p>
     <w:p/>

</xml_diff>